<commit_message>
Brief and project notes: PWA not native, webpack pin, mark rules
</commit_message>
<xml_diff>
--- a/Shigo-InnovateX-2026-Build-Brief.docx
+++ b/Shigo-InnovateX-2026-Build-Brief.docx
@@ -3035,7 +3035,7 @@
           <w:sz w:val="22"/>
           <w:szCs w:val="22"/>
         </w:rPr>
-        <w:t xml:space="preserve">Three pieces: a phone app for the seller, a small server that receives bank callbacks and keeps the ledger, and the bank's sandbox.</w:t>
+        <w:t xml:space="preserve">Three pieces: a phone-sized web app for the seller (built with Next.js, installable as a PWA), a small server that receives bank callbacks and keeps the ledger, and the bank's sandbox.</w:t>
       </w:r>
     </w:p>
     <w:p>
@@ -3063,7 +3063,7 @@
           <w:sz w:val="22"/>
           <w:szCs w:val="22"/>
         </w:rPr>
-        <w:t xml:space="preserve"> (Flutter or React Native): create order, share payment details to WhatsApp, order list with amber and green states, ledger totals, export to PDF, "report attempt" form.</w:t>
+        <w:t xml:space="preserve"> (a mobile-first web app that installs to the home screen; no app store, judges can open it from a QR code): create order, share payment details to WhatsApp, order list with amber and green states, ledger totals, export to PDF, "report attempt" form.</w:t>
       </w:r>
     </w:p>
     <w:p>
@@ -6647,7 +6647,7 @@
         </w:numPr>
         <w:spacing w:after="60"/>
       </w:pPr>
-      <w:hyperlink w:history="1" r:id="rIdnlcvcrwjstb7jtsepmcdf">
+      <w:hyperlink w:history="1" r:id="rIdojecgmx12jdsfwefb4cxp">
         <w:r>
           <w:rPr>
             <w:rStyle w:val="Hyperlink"/>
@@ -6668,7 +6668,7 @@
         </w:numPr>
         <w:spacing w:after="60"/>
       </w:pPr>
-      <w:hyperlink w:history="1" r:id="rIdlpfwvj9nra35hddeqz1cg">
+      <w:hyperlink w:history="1" r:id="rId4tlukadmgfli9wyzo2onk">
         <w:r>
           <w:rPr>
             <w:rStyle w:val="Hyperlink"/>
@@ -6689,7 +6689,7 @@
         </w:numPr>
         <w:spacing w:after="60"/>
       </w:pPr>
-      <w:hyperlink w:history="1" r:id="rIdbdqkxc6g6nrqbgbd9n8ac">
+      <w:hyperlink w:history="1" r:id="rIdm5onwn0exzmozl2c-menq">
         <w:r>
           <w:rPr>
             <w:rStyle w:val="Hyperlink"/>
@@ -6710,7 +6710,7 @@
         </w:numPr>
         <w:spacing w:after="60"/>
       </w:pPr>
-      <w:hyperlink w:history="1" r:id="rId66lcgofnbi1d2evzxhd0s">
+      <w:hyperlink w:history="1" r:id="rIdpksd1resrvc04tn_8iks4">
         <w:r>
           <w:rPr>
             <w:rStyle w:val="Hyperlink"/>
@@ -6731,7 +6731,7 @@
         </w:numPr>
         <w:spacing w:after="60"/>
       </w:pPr>
-      <w:hyperlink w:history="1" r:id="rIdjfoukuvk5nmktwo8mlzss">
+      <w:hyperlink w:history="1" r:id="rIdjsveduq8htxtc_5xoszfy">
         <w:r>
           <w:rPr>
             <w:rStyle w:val="Hyperlink"/>
@@ -6752,7 +6752,7 @@
         </w:numPr>
         <w:spacing w:after="60"/>
       </w:pPr>
-      <w:hyperlink w:history="1" r:id="rIdbowap8_ulprmbzzsua677">
+      <w:hyperlink w:history="1" r:id="rIdqsltjg_jah3bljbchf94q">
         <w:r>
           <w:rPr>
             <w:rStyle w:val="Hyperlink"/>
@@ -6773,7 +6773,7 @@
         </w:numPr>
         <w:spacing w:after="60"/>
       </w:pPr>
-      <w:hyperlink w:history="1" r:id="rIdrdgayqqpwb3f-xwapu0kl">
+      <w:hyperlink w:history="1" r:id="rIdnp1wucza8jlpbj-yohjjf">
         <w:r>
           <w:rPr>
             <w:rStyle w:val="Hyperlink"/>
@@ -6794,7 +6794,7 @@
         </w:numPr>
         <w:spacing w:after="60"/>
       </w:pPr>
-      <w:hyperlink w:history="1" r:id="rIdydgfyo5nckhp1prwjhh73">
+      <w:hyperlink w:history="1" r:id="rIds6ntfgrc2kvyumjug72qk">
         <w:r>
           <w:rPr>
             <w:rStyle w:val="Hyperlink"/>
@@ -6815,7 +6815,7 @@
         </w:numPr>
         <w:spacing w:after="60"/>
       </w:pPr>
-      <w:hyperlink w:history="1" r:id="rIdlodgrdmmxxki5crfdr7ba">
+      <w:hyperlink w:history="1" r:id="rId8-8l8z0ey-hrxs6cgixig">
         <w:r>
           <w:rPr>
             <w:rStyle w:val="Hyperlink"/>
@@ -6836,7 +6836,7 @@
         </w:numPr>
         <w:spacing w:after="60"/>
       </w:pPr>
-      <w:hyperlink w:history="1" r:id="rId9ebf1tkj5zn-oxzirllqj">
+      <w:hyperlink w:history="1" r:id="rId5kus8mvuph5znmhgich83">
         <w:r>
           <w:rPr>
             <w:rStyle w:val="Hyperlink"/>
@@ -6857,7 +6857,7 @@
         </w:numPr>
         <w:spacing w:after="60"/>
       </w:pPr>
-      <w:hyperlink w:history="1" r:id="rIdzk03pnjq8pkybbo16jpvc">
+      <w:hyperlink w:history="1" r:id="rIdwqf5vyicv5_by8khcypr_">
         <w:r>
           <w:rPr>
             <w:rStyle w:val="Hyperlink"/>

</xml_diff>